<commit_message>
docs: agrega los guiones, guias de pantalla y el plan del modulo 4 y ajusta el video 3 del modulo 3
</commit_message>
<xml_diff>
--- a/docs/capacitacion/guion youtube/modulo-3-presentacion-del-sistema-y-codigo/video-3-medicion-escala-y-retos/modulo-3-video-3-medicion-escala-y-retos-natural.docx
+++ b/docs/capacitacion/guion youtube/modulo-3-presentacion-del-sistema-y-codigo/video-3-medicion-escala-y-retos/modulo-3-video-3-medicion-escala-y-retos-natural.docx
@@ -27,7 +27,7 @@
         <w:rPr>
           <w:i/>
         </w:rPr>
-        <w:t>4,785 palabras, unos 27.3 min de habla</w:t>
+        <w:t>4,793 palabras, unos 27.4 min de habla</w:t>
       </w:r>
     </w:p>
     <w:p>
@@ -410,7 +410,7 @@
       </w:r>
       <w:r>
         <w:rPr/>
-        <w:t>: líneas 37 a 40 y 134 y 135. Después, otra vez la salida del comando A, para hacer la cuenta.</w:t>
+        <w:t>: líneas 38 a 40 y 134 y 135. Después, otra vez la salida del comando A, para hacer la cuenta.</w:t>
       </w:r>
     </w:p>
     <w:p>
@@ -418,7 +418,7 @@
         <w:rPr>
           <w:color w:val="C00000"/>
         </w:rPr>
-        <w:t>[Acción: líneas 37 a 40: la constante PX_POR_MICRA]</w:t>
+        <w:t>[Acción: líneas 38 a 40: la constante PX_POR_MICRA]</w:t>
       </w:r>
     </w:p>
     <w:p>
@@ -430,7 +430,7 @@
     <w:p>
       <w:r>
         <w:rPr/>
-        <w:t>La línea 40 dice PX por micra igual a 60. Son 60 píxeles por cada micra. Los comentarios de arriba cuentan de dónde sale: de una indicación del cliente, por chat, el 16 de octubre de 2026. Una raya de 300 píxeles equivale a 5 micras. Y 300 entre 5 son 60.</w:t>
+        <w:t>La línea 40 dice PX por micra igual a 60. Son 60 píxeles por cada micra. Los comentarios de arriba cuentan de dónde sale: de una indicación del laboratorio, por chat, el 16 de octubre de 2026. Una raya de 300 píxeles equivale a 5 micras. Y 300 entre 5 son 60.</w:t>
       </w:r>
     </w:p>
     <w:p>
@@ -490,7 +490,7 @@
       </w:pPr>
       <w:r>
         <w:rPr/>
-        <w:t>Idea central: La escala no se puede sacar de las fotos, porque no traen barra de escala ni regla impresa. Por eso es una constante provisional. Con ella, la imagen de ejemplo da cabezas de menos de una micra, que no es creíble. Las micras del sitio son aproximadas, y el sitio lo dice.</w:t>
+        <w:t>Idea central: La escala no se puede sacar de las fotos, porque no traen barra de escala ni regla impresa. Se habló con el laboratorio y de ahí salió un valor de partida, una constante provisional. Con ella, la imagen de ejemplo da cabezas de menos de una micra, que no es creíble. Las micras del sitio son aproximadas, y el sitio lo dice.</w:t>
       </w:r>
     </w:p>
     <w:p>
@@ -504,18 +504,7 @@
       </w:pPr>
       <w:r>
         <w:rPr/>
-        <w:t xml:space="preserve">En pantalla: Terminal, comando B (el análisis de la imagen de ejemplo). Después </w:t>
-      </w:r>
-      <w:r>
-        <w:rPr>
-          <w:rFonts w:ascii="Consolas" w:hAnsi="Consolas"/>
-          <w:sz w:val="21"/>
-        </w:rPr>
-        <w:t>docs/integracion-modelos.md</w:t>
-      </w:r>
-      <w:r>
-        <w:rPr/>
-        <w:t>, sección «Escala en micras», líneas 36 a 51.</w:t>
+        <w:t>En pantalla: Terminal, comando B (el análisis de la imagen de ejemplo).</w:t>
       </w:r>
     </w:p>
     <w:p>
@@ -541,27 +530,19 @@
     <w:p>
       <w:r>
         <w:rPr/>
-        <w:t>Aquí hay que detenerse. Una cabeza de espermatozoide mide varias micras de largo. Y el contorno, además, incluye un pedazo de cola, así que debería salir más largo, no más corto. Un resultado de media micra no es creíble. Dicho de otra forma: con esta escala, esta imagen no sale en micras reales. No sabemos con qué ajuste se tomó la imagen de ejemplo, ni si tiene la misma escala que las fotos del cliente. Lo que sí sabemos es que la escala del código es provisional. Por eso el sitio no la presenta como una calibración.</w:t>
-      </w:r>
-    </w:p>
-    <w:p>
-      <w:r>
-        <w:rPr>
-          <w:color w:val="C00000"/>
-        </w:rPr>
-        <w:t>[Acción: abre docs/integracion-modelos.md, sección «Escala en micras», líneas 36 a 51]</w:t>
+        <w:t>Aquí hay que detenerse. Una cabeza de espermatozoide mide varias micras de largo. Y el contorno, además, incluye un pedazo de cola, así que debería salir más largo, no más corto. Un resultado de media micra no es creíble. Dicho de otra forma: con esta escala, esta imagen no sale en micras reales. No sabemos con qué ajuste se tomó la imagen de ejemplo, ni si tiene la misma escala que las fotos del laboratorio. Lo que sí sabemos es que la escala del código es provisional. Por eso el sitio no la presenta como una calibración.</w:t>
       </w:r>
     </w:p>
     <w:p>
       <w:r>
         <w:rPr/>
-        <w:t>La documentación explica por qué no se puede sacar la escala de las fotos. Las fotos del cliente no traen barra de escala ni regla impresa, y los archivos BMP tampoco guardan una medida. De la imagen sola no se puede deducir cuánto mide un píxel, salvo que supongas el tamaño de algo. Y aquí no se debe suponer nada del espermatozoide.</w:t>
+        <w:t>¿Por qué no se puede sacar la escala de las fotos? Porque las fotos del laboratorio no traen barra de escala ni regla impresa, y los archivos BMP tampoco guardan una medida. De la imagen sola no se puede deducir cuánto mide un píxel, salvo que supongas el tamaño de algo. Y aquí no se debe suponer nada del espermatozoide.</w:t>
       </w:r>
     </w:p>
     <w:p>
       <w:r>
         <w:rPr/>
-        <w:t>De qué depende de verdad la escala: del aumento del objetivo del microscopio, que es de 40 veces; del tamaño del sensor de la cámara y de cualquier adaptador; y de la resolución a la que se guarda la foto. Las fotos del cliente vienen en dos tamaños, de 1,792 y de 3,584 píxeles de ancho. Si son del mismo campo con distinta resolución, cada una necesita su propio valor, y el de la grande sería el doble. Esa es una pregunta abierta.</w:t>
+        <w:t>Por eso se habló con el laboratorio, y de ahí salió el valor de partida de 60 píxeles por micra. Es un valor de trabajo, no una medición hecha con una regla en su microscopio. Porque la escala depende de verdad del aumento del objetivo del microscopio, que es de 40 veces; del tamaño del sensor de la cámara y de cualquier adaptador; y de la resolución a la que se guarda la foto. Las fotos del laboratorio vienen en dos tamaños, de 1,792 y de 3,584 píxeles de ancho. Si son del mismo campo con distinta resolución, cada una necesita su propio valor, y el de la grande sería el doble. Esa es una pregunta abierta, y queda por aclarar con ellos.</w:t>
       </w:r>
     </w:p>
     <w:p>
@@ -1124,18 +1105,7 @@
       </w:pPr>
       <w:r>
         <w:rPr/>
-        <w:t xml:space="preserve">En pantalla: </w:t>
-      </w:r>
-      <w:r>
-        <w:rPr>
-          <w:rFonts w:ascii="Consolas" w:hAnsi="Consolas"/>
-          <w:sz w:val="21"/>
-        </w:rPr>
-        <w:t>docs/base-conocimiento/03-decisiones.md</w:t>
-      </w:r>
-      <w:r>
-        <w:rPr/>
-        <w:t xml:space="preserve">, líneas 12 y 13. Editor, </w:t>
+        <w:t xml:space="preserve">En pantalla: Editor, </w:t>
       </w:r>
       <w:r>
         <w:rPr>
@@ -1146,26 +1116,7 @@
       </w:r>
       <w:r>
         <w:rPr/>
-        <w:t xml:space="preserve">, líneas 67 a 98. Terminal, comando E. </w:t>
-      </w:r>
-      <w:r>
-        <w:rPr>
-          <w:rFonts w:ascii="Consolas" w:hAnsi="Consolas"/>
-          <w:sz w:val="21"/>
-        </w:rPr>
-        <w:t>docs/base-conocimiento/05-limitaciones.md</w:t>
-      </w:r>
-      <w:r>
-        <w:rPr/>
-        <w:t>, línea 6.</w:t>
-      </w:r>
-    </w:p>
-    <w:p>
-      <w:r>
-        <w:rPr>
-          <w:color w:val="C00000"/>
-        </w:rPr>
-        <w:t>[Acción: docs/base-conocimiento/03-decisiones.md, líneas 12 y 13: «Un umbral simple no bastaba»]</w:t>
+        <w:t>, líneas 67 a 98. Terminal, comando E.</w:t>
       </w:r>
     </w:p>
     <w:p>
@@ -1177,7 +1128,7 @@
     <w:p>
       <w:r>
         <w:rPr/>
-        <w:t>Lo primero que se intentó fue lo más simple, un umbral de color. Un umbral es un valor de corte: todo píxel más brillante que ese valor es parte de una célula, y el resto es fondo. Esta nota de las decisiones explica por qué no bastó. Tres razones. Las colas y las manchas también brillan. Las células encimadas se funden en una sola mancha. Y el brillo cambia con la iluminación de cada foto.</w:t>
+        <w:t>Lo primero que se intentó fue lo más simple, un umbral de color. Un umbral es un valor de corte: todo píxel más brillante que ese valor es parte de una célula, y el resto es fondo. No bastó, por tres razones. Las colas y las manchas también brillan. Las células encimadas se funden en una sola mancha. Y el brillo cambia con la iluminación de cada foto.</w:t>
       </w:r>
     </w:p>
     <w:p>
@@ -1216,16 +1167,8 @@
     </w:p>
     <w:p>
       <w:r>
-        <w:rPr>
-          <w:color w:val="C00000"/>
-        </w:rPr>
-        <w:t>[Acción: docs/base-conocimiento/05-limitaciones.md, línea 6: conteos aproximados con células juntas]</w:t>
-      </w:r>
-    </w:p>
-    <w:p>
-      <w:r>
         <w:rPr/>
-        <w:t>Con los modelos el problema cambia, pero no se va. La documentación lo dice sin rodeos: en zonas con muchos espermatozoides juntos, el modelo puede repetir un contorno, partir uno en dos o no encontrar algunos. Contra los repetidos hay tres defensas, que vimos en el video anterior: descartar lo que toca el borde interno de una tesela, quitar repetidos con el IoU y el filtro de contenido. Ayudan. No son perfectas. Por eso los conteos del sitio son aproximados.</w:t>
+        <w:t>Con los modelos el problema cambia, pero no se va. Hay que decirlo sin rodeos: en zonas con muchos espermatozoides juntos, el modelo puede repetir un contorno, partir uno en dos o no encontrar algunos. Contra los repetidos hay tres defensas, que vimos en el video anterior: descartar lo que toca el borde interno de una tesela, quitar repetidos con el IoU y el filtro de contenido. Ayudan. No son perfectas. Por eso los conteos del sitio son aproximados.</w:t>
       </w:r>
     </w:p>
     <w:p>
@@ -1265,18 +1208,7 @@
       </w:pPr>
       <w:r>
         <w:rPr/>
-        <w:t xml:space="preserve">En pantalla: </w:t>
-      </w:r>
-      <w:r>
-        <w:rPr>
-          <w:rFonts w:ascii="Consolas" w:hAnsi="Consolas"/>
-          <w:sz w:val="21"/>
-        </w:rPr>
-        <w:t>docs/base-conocimiento/05-limitaciones.md</w:t>
-      </w:r>
-      <w:r>
-        <w:rPr/>
-        <w:t xml:space="preserve">, línea 7. Editor, </w:t>
+        <w:t xml:space="preserve">En pantalla: Editor, </w:t>
       </w:r>
       <w:r>
         <w:rPr>
@@ -1292,14 +1224,6 @@
     </w:p>
     <w:p>
       <w:r>
-        <w:rPr>
-          <w:color w:val="C00000"/>
-        </w:rPr>
-        <w:t>[Acción: docs/base-conocimiento/05-limitaciones.md, línea 7: sin ejemplos negativos]</w:t>
-      </w:r>
-    </w:p>
-    <w:p>
-      <w:r>
         <w:rPr/>
         <w:t>El segundo reto son los falsos positivos. Un falso positivo es algo que el sistema marca como espermatozoide y no lo es. Ya hablamos de esto en el módulo 2, en el video de Mask R-CNN. Recuerda el ejemplo. Con un recorte de una foto de células con núcleos fluorescentes, sin ningún espermatozoide, el modelo marcó un núcleo con 0.96 y un trozo de fibra con 1.00. Un puntaje alto no garantiza que sea un espermatozoide.</w:t>
       </w:r>
@@ -1307,7 +1231,7 @@
     <w:p>
       <w:r>
         <w:rPr/>
-        <w:t>¿Por qué pasa? La documentación lo resume en una frase: sin ejemplos negativos. Un ejemplo negativo es una foto, o un pedazo de foto, donde la respuesta correcta es que no hay nada que marcar. Los modelos se entrenaron con cuatro fotos por tipo, todas con espermatozoides. Nunca vieron una fibra o un núcleo con la etiqueta de que eso no es. Y por eso, ante algo brillante y compacto, tienden a marcarlo.</w:t>
+        <w:t>¿Por qué pasa? Se resume en una frase: sin ejemplos negativos. Un ejemplo negativo es una foto, o un pedazo de foto, donde la respuesta correcta es que no hay nada que marcar. Los modelos se entrenaron con cuatro fotos por tipo, todas con espermatozoides. Nunca vieron una fibra o un núcleo con la etiqueta de que eso no es. Y por eso, ante algo brillante y compacto, tienden a marcarlo.</w:t>
       </w:r>
     </w:p>
     <w:p>
@@ -1367,32 +1291,13 @@
       </w:pPr>
       <w:r>
         <w:rPr/>
-        <w:t xml:space="preserve">En pantalla: </w:t>
-      </w:r>
-      <w:r>
-        <w:rPr>
-          <w:rFonts w:ascii="Consolas" w:hAnsi="Consolas"/>
-          <w:sz w:val="21"/>
-        </w:rPr>
-        <w:t>docs/base-conocimiento/05-limitaciones.md</w:t>
-      </w:r>
-      <w:r>
-        <w:rPr/>
-        <w:t>, línea 9. Terminal, comando F de la guía y, otra vez, la salida del comando B.</w:t>
-      </w:r>
-    </w:p>
-    <w:p>
-      <w:r>
-        <w:rPr>
-          <w:color w:val="C00000"/>
-        </w:rPr>
-        <w:t>[Acción: docs/base-conocimiento/05-limitaciones.md, línea 9: el largo no es la longitud de la curva]</w:t>
+        <w:t>En pantalla: Terminal, comando F de la guía y, otra vez, la salida del comando B.</w:t>
       </w:r>
     </w:p>
     <w:p>
       <w:r>
         <w:rPr/>
-        <w:t>El tercer reto es qué significa largo. La documentación lo aclara. El largo no es la longitud de la curva. Es el lado mayor del rectángulo mínimo del contorno. Y el contorno incluye la cabeza y parte de la cola, no solo la cabeza. Por eso en pantalla, CSV y PDF se cambió cabeza por espermatozoide.</w:t>
+        <w:t>El tercer reto es qué significa largo, y conviene aclararlo. El largo no es la longitud de la curva. Es el lado mayor del rectángulo mínimo del contorno. Y el contorno incluye la cabeza y parte de la cola, no solo la cabeza. Por eso en pantalla, CSV y PDF se cambió cabeza por espermatozoide.</w:t>
       </w:r>
     </w:p>
     <w:p>
@@ -1438,7 +1343,7 @@
     <w:p>
       <w:r>
         <w:rPr/>
-        <w:t>Con la escala, ese máximo es 1.46 micras y el mínimo, 0.25. Dos números en micras que parecen medidas, y que dependen de una escala provisional y de si el contorno es una cabeza o una cola. Es el cuidado que pide la documentación en sus riesgos: un resultado numérico puede parecer más exacto de lo que es.</w:t>
+        <w:t>Con la escala, ese máximo es 1.46 micras y el mínimo, 0.25. Dos números en micras que parecen medidas, y que dependen de una escala provisional y de si el contorno es una cabeza o una cola. Es un cuidado que hay que tener: un resultado numérico puede parecer más exacto de lo que es.</w:t>
       </w:r>
     </w:p>
     <w:p>
@@ -1495,18 +1400,7 @@
       </w:r>
       <w:r>
         <w:rPr/>
-        <w:t xml:space="preserve">, líneas 47 y 249 a 252. Terminal, comando G de la guía. </w:t>
-      </w:r>
-      <w:r>
-        <w:rPr>
-          <w:rFonts w:ascii="Consolas" w:hAnsi="Consolas"/>
-          <w:sz w:val="21"/>
-        </w:rPr>
-        <w:t>docs/integracion-modelos.md</w:t>
-      </w:r>
-      <w:r>
-        <w:rPr/>
-        <w:t>, líneas 29 y 30, y línea 68.</w:t>
+        <w:t>, líneas 47 y 249 a 252. Terminal, comando G de la guía.</w:t>
       </w:r>
     </w:p>
     <w:p>
@@ -1551,14 +1445,6 @@
     </w:p>
     <w:p>
       <w:r>
-        <w:rPr>
-          <w:color w:val="C00000"/>
-        </w:rPr>
-        <w:t>[Acción: docs/integracion-modelos.md, líneas 29 y 30, y la decisión 2 de la línea 68]</w:t>
-      </w:r>
-    </w:p>
-    <w:p>
-      <w:r>
         <w:rPr/>
         <w:t>Y están las fotos grandes. En fluorescencia, una foto de 1,792 píxeles de ancho se corta en 20 teselas, como vimos, y una de 3,584, en 63. Cada tesela pasa por la red, en procesador y sin tarjeta gráfica, así que cada foto tarda decenas de segundos. Del servidor real todavía no hay una medición.</w:t>
       </w:r>
@@ -1566,7 +1452,7 @@
     <w:p>
       <w:r>
         <w:rPr/>
-        <w:t>¿Cómo se resolvió? El cliente pidió poder subir 10 imágenes a la vez y ver una barra de progreso. Se mantuvieron las dos cosas, con tiempos de espera altos, de 1,800 segundos en Gunicorn y en Nginx, y con análisis de uno en uno. Si en el servidor real diez imágenes tardan demasiado, el plan es limitar cuántas se suben, o pasar el análisis a segundo plano. Eso falta medirlo.</w:t>
+        <w:t>¿Cómo se resolvió? El laboratorio pidió poder subir 10 imágenes a la vez y ver una barra de progreso. Se mantuvieron las dos cosas, con tiempos de espera altos, de 1,800 segundos en Gunicorn y en Nginx, y con análisis de uno en uno. Si en el servidor real diez imágenes tardan demasiado, el plan es limitar cuántas se suben, o pasar el análisis a segundo plano. Eso falta medirlo.</w:t>
       </w:r>
     </w:p>
     <w:p>
@@ -1617,18 +1503,7 @@
       </w:r>
       <w:r>
         <w:rPr/>
-        <w:t xml:space="preserve">, líneas 31 a 35 y 125 y 126. </w:t>
-      </w:r>
-      <w:r>
-        <w:rPr>
-          <w:rFonts w:ascii="Consolas" w:hAnsi="Consolas"/>
-          <w:sz w:val="21"/>
-        </w:rPr>
-        <w:t>docs/base-conocimiento/05-limitaciones.md</w:t>
-      </w:r>
-      <w:r>
-        <w:rPr/>
-        <w:t>, líneas 20 a 27.</w:t>
+        <w:t>, líneas 31 a 35 y 125 y 126.</w:t>
       </w:r>
     </w:p>
     <w:p>
@@ -1648,27 +1523,19 @@
     <w:p>
       <w:r>
         <w:rPr/>
-        <w:t>Pero el color ya no se muestra. En el plan de integración se decidió seguir guardándolo y dejar de mostrarlo en resultados, CSV y PDF. Está declarado, sin usar, por si hace falta más adelante.</w:t>
-      </w:r>
-    </w:p>
-    <w:p>
-      <w:r>
-        <w:rPr>
-          <w:color w:val="C00000"/>
-        </w:rPr>
-        <w:t>[Acción: docs/base-conocimiento/05-limitaciones.md, líneas 20 a 27: trabajo futuro]</w:t>
+        <w:t>Pero el color ya no se muestra. Se decidió seguir guardándolo y dejar de mostrarlo en resultados, CSV y PDF. Está declarado, sin usar, por si hace falta más adelante.</w:t>
       </w:r>
     </w:p>
     <w:p>
       <w:r>
         <w:rPr/>
-        <w:t>Y lo que falta, según el propio proyecto. Medir el tiempo y la memoria en el servidor real. Reunir más imágenes, variadas y bien etiquetadas, con ejemplos negativos, y volver a entrenar. Validar con fotos que la red nunca haya visto. Medir de cabeza a cola. Avisar si la imagen no parece de espermatozoides. Quizá cambiar el largo a la longitud de la curva. Y, como extensión fuera del alcance actual, comparar control contra tratamiento.</w:t>
+        <w:t>Y lo que falta. Medir el tiempo y la memoria en el servidor real. Reunir más imágenes, variadas y bien etiquetadas, con ejemplos negativos, y volver a entrenar. Validar con fotos que la red nunca haya visto. Medir de cabeza a cola. Avisar si la imagen no parece de espermatozoides. Quizá cambiar el largo a la longitud de la curva. Y, como extensión fuera del alcance actual, comparar control contra tratamiento.</w:t>
       </w:r>
     </w:p>
     <w:p>
       <w:r>
         <w:rPr/>
-        <w:t>A esa lista se suma la calibración de la escala, que vimos antes. Y yo agregaría una cosa, por lo que vimos hoy: descartar los contornos muy alargados que da el modelo. Pero ojo con la última línea de la documentación sobre los límites. El sitio mide. La lectura científica es del grupo de investigación.</w:t>
+        <w:t>A esa lista se suma la calibración de la escala, que vimos antes. Y yo agregaría una cosa, por lo que vimos hoy: descartar los contornos muy alargados que da el modelo. Pero ojo con un límite. El sitio mide. La lectura científica es del grupo de investigación.</w:t>
       </w:r>
     </w:p>
     <w:p>
@@ -1739,7 +1606,7 @@
     <w:p>
       <w:r>
         <w:rPr/>
-        <w:t>La red localiza y el código mide. Del contorno salen dos medidas: el área, que son los píxeles de la máscara, y el largo, que es el lado mayor del rectángulo mínimo. Las dos salen en píxeles, y se pasan a micras con una escala provisional de 60 píxeles por micra. Esa escala no sale de las fotos. Viene de una indicación del cliente, y con ella la imagen de ejemplo da cabezas de menos de una micra. Por eso las micras son aproximadas.</w:t>
+        <w:t>La red localiza y el código mide. Del contorno salen dos medidas: el área, que son los píxeles de la máscara, y el largo, que es el lado mayor del rectángulo mínimo. Las dos salen en píxeles, y se pasan a micras con una escala provisional de 60 píxeles por micra. Esa escala no sale de las fotos. Viene de una indicación del laboratorio, y con ella la imagen de ejemplo da cabezas de menos de una micra. Por eso las micras son aproximadas.</w:t>
       </w:r>
     </w:p>
     <w:p>

</xml_diff>